<commit_message>
Mo ta 2 done
</commit_message>
<xml_diff>
--- a/NguyenHoVietKhoa_22683901_Lab3.docx
+++ b/NguyenHoVietKhoa_22683901_Lab3.docx
@@ -73,6 +73,255 @@
                     <a:xfrm>
                       <a:off x="0" y="0"/>
                       <a:ext cx="4724400" cy="3133725"/>
+                    </a:xfrm>
+                    <a:prstGeom prst="rect">
+                      <a:avLst/>
+                    </a:prstGeom>
+                  </pic:spPr>
+                </pic:pic>
+              </a:graphicData>
+            </a:graphic>
+          </wp:inline>
+        </w:drawing>
+      </w:r>
+    </w:p>
+    <w:p>
+      <w:pPr>
+        <w:rPr>
+          <w:rFonts w:ascii="Times New Roman" w:hAnsi="Times New Roman" w:cs="Times New Roman"/>
+          <w:b/>
+          <w:bCs/>
+          <w:sz w:val="26"/>
+          <w:szCs w:val="26"/>
+        </w:rPr>
+      </w:pPr>
+      <w:r>
+        <w:rPr>
+          <w:rFonts w:ascii="Times New Roman" w:hAnsi="Times New Roman" w:cs="Times New Roman"/>
+          <w:b/>
+          <w:bCs/>
+          <w:sz w:val="26"/>
+          <w:szCs w:val="26"/>
+        </w:rPr>
+        <w:drawing>
+          <wp:inline distT="0" distB="0" distL="0" distR="0" wp14:anchorId="4DB19CD1" wp14:editId="4CD24214">
+            <wp:extent cx="5943600" cy="2824480"/>
+            <wp:effectExtent l="0" t="0" r="0" b="0"/>
+            <wp:docPr id="152766781" name="Picture 1"/>
+            <wp:cNvGraphicFramePr>
+              <a:graphicFrameLocks xmlns:a="http://schemas.openxmlformats.org/drawingml/2006/main" noChangeAspect="1"/>
+            </wp:cNvGraphicFramePr>
+            <a:graphic xmlns:a="http://schemas.openxmlformats.org/drawingml/2006/main">
+              <a:graphicData uri="http://schemas.openxmlformats.org/drawingml/2006/picture">
+                <pic:pic xmlns:pic="http://schemas.openxmlformats.org/drawingml/2006/picture">
+                  <pic:nvPicPr>
+                    <pic:cNvPr id="152766781" name=""/>
+                    <pic:cNvPicPr/>
+                  </pic:nvPicPr>
+                  <pic:blipFill>
+                    <a:blip r:embed="rId5"/>
+                    <a:stretch>
+                      <a:fillRect/>
+                    </a:stretch>
+                  </pic:blipFill>
+                  <pic:spPr>
+                    <a:xfrm>
+                      <a:off x="0" y="0"/>
+                      <a:ext cx="5943600" cy="2824480"/>
+                    </a:xfrm>
+                    <a:prstGeom prst="rect">
+                      <a:avLst/>
+                    </a:prstGeom>
+                  </pic:spPr>
+                </pic:pic>
+              </a:graphicData>
+            </a:graphic>
+          </wp:inline>
+        </w:drawing>
+      </w:r>
+    </w:p>
+    <w:p>
+      <w:pPr>
+        <w:rPr>
+          <w:rFonts w:ascii="Times New Roman" w:hAnsi="Times New Roman" w:cs="Times New Roman"/>
+          <w:b/>
+          <w:bCs/>
+          <w:sz w:val="26"/>
+          <w:szCs w:val="26"/>
+        </w:rPr>
+      </w:pPr>
+    </w:p>
+    <w:p>
+      <w:pPr>
+        <w:rPr>
+          <w:rFonts w:ascii="Times New Roman" w:hAnsi="Times New Roman" w:cs="Times New Roman"/>
+          <w:b/>
+          <w:bCs/>
+          <w:sz w:val="26"/>
+          <w:szCs w:val="26"/>
+        </w:rPr>
+      </w:pPr>
+    </w:p>
+    <w:p>
+      <w:pPr>
+        <w:rPr>
+          <w:rFonts w:ascii="Times New Roman" w:hAnsi="Times New Roman" w:cs="Times New Roman"/>
+          <w:b/>
+          <w:bCs/>
+          <w:sz w:val="26"/>
+          <w:szCs w:val="26"/>
+        </w:rPr>
+      </w:pPr>
+    </w:p>
+    <w:p>
+      <w:pPr>
+        <w:rPr>
+          <w:rFonts w:ascii="Times New Roman" w:hAnsi="Times New Roman" w:cs="Times New Roman"/>
+          <w:b/>
+          <w:bCs/>
+          <w:sz w:val="26"/>
+          <w:szCs w:val="26"/>
+        </w:rPr>
+      </w:pPr>
+    </w:p>
+    <w:p>
+      <w:pPr>
+        <w:rPr>
+          <w:rFonts w:ascii="Times New Roman" w:hAnsi="Times New Roman" w:cs="Times New Roman"/>
+          <w:b/>
+          <w:bCs/>
+          <w:sz w:val="26"/>
+          <w:szCs w:val="26"/>
+        </w:rPr>
+      </w:pPr>
+    </w:p>
+    <w:p>
+      <w:pPr>
+        <w:rPr>
+          <w:rFonts w:ascii="Times New Roman" w:hAnsi="Times New Roman" w:cs="Times New Roman"/>
+          <w:b/>
+          <w:bCs/>
+          <w:sz w:val="26"/>
+          <w:szCs w:val="26"/>
+        </w:rPr>
+      </w:pPr>
+      <w:r>
+        <w:rPr>
+          <w:rFonts w:ascii="Times New Roman" w:hAnsi="Times New Roman" w:cs="Times New Roman"/>
+          <w:b/>
+          <w:bCs/>
+          <w:sz w:val="26"/>
+          <w:szCs w:val="26"/>
+        </w:rPr>
+        <w:lastRenderedPageBreak/>
+        <w:t xml:space="preserve">Mô tả 2: </w:t>
+      </w:r>
+    </w:p>
+    <w:p>
+      <w:pPr>
+        <w:rPr>
+          <w:rFonts w:ascii="Times New Roman" w:hAnsi="Times New Roman" w:cs="Times New Roman"/>
+          <w:b/>
+          <w:bCs/>
+          <w:sz w:val="26"/>
+          <w:szCs w:val="26"/>
+        </w:rPr>
+      </w:pPr>
+      <w:r>
+        <w:rPr>
+          <w:rFonts w:ascii="Times New Roman" w:hAnsi="Times New Roman" w:cs="Times New Roman"/>
+          <w:b/>
+          <w:bCs/>
+          <w:noProof/>
+          <w:sz w:val="26"/>
+          <w:szCs w:val="26"/>
+        </w:rPr>
+        <w:drawing>
+          <wp:inline distT="0" distB="0" distL="0" distR="0" wp14:anchorId="56C25E19" wp14:editId="7215F614">
+            <wp:extent cx="4276725" cy="4629150"/>
+            <wp:effectExtent l="0" t="0" r="9525" b="0"/>
+            <wp:docPr id="1651345622" name="Picture 1"/>
+            <wp:cNvGraphicFramePr>
+              <a:graphicFrameLocks xmlns:a="http://schemas.openxmlformats.org/drawingml/2006/main" noChangeAspect="1"/>
+            </wp:cNvGraphicFramePr>
+            <a:graphic xmlns:a="http://schemas.openxmlformats.org/drawingml/2006/main">
+              <a:graphicData uri="http://schemas.openxmlformats.org/drawingml/2006/picture">
+                <pic:pic xmlns:pic="http://schemas.openxmlformats.org/drawingml/2006/picture">
+                  <pic:nvPicPr>
+                    <pic:cNvPr id="1651345622" name="Picture 1651345622"/>
+                    <pic:cNvPicPr/>
+                  </pic:nvPicPr>
+                  <pic:blipFill>
+                    <a:blip r:embed="rId6">
+                      <a:extLst>
+                        <a:ext uri="{28A0092B-C50C-407E-A947-70E740481C1C}">
+                          <a14:useLocalDpi xmlns:a14="http://schemas.microsoft.com/office/drawing/2010/main" val="0"/>
+                        </a:ext>
+                      </a:extLst>
+                    </a:blip>
+                    <a:stretch>
+                      <a:fillRect/>
+                    </a:stretch>
+                  </pic:blipFill>
+                  <pic:spPr>
+                    <a:xfrm>
+                      <a:off x="0" y="0"/>
+                      <a:ext cx="4276725" cy="4629150"/>
+                    </a:xfrm>
+                    <a:prstGeom prst="rect">
+                      <a:avLst/>
+                    </a:prstGeom>
+                  </pic:spPr>
+                </pic:pic>
+              </a:graphicData>
+            </a:graphic>
+          </wp:inline>
+        </w:drawing>
+      </w:r>
+    </w:p>
+    <w:p>
+      <w:pPr>
+        <w:rPr>
+          <w:rFonts w:ascii="Times New Roman" w:hAnsi="Times New Roman" w:cs="Times New Roman"/>
+          <w:b/>
+          <w:bCs/>
+          <w:sz w:val="26"/>
+          <w:szCs w:val="26"/>
+        </w:rPr>
+      </w:pPr>
+      <w:r>
+        <w:rPr>
+          <w:rFonts w:ascii="Times New Roman" w:hAnsi="Times New Roman" w:cs="Times New Roman"/>
+          <w:b/>
+          <w:bCs/>
+          <w:sz w:val="26"/>
+          <w:szCs w:val="26"/>
+        </w:rPr>
+        <w:drawing>
+          <wp:inline distT="0" distB="0" distL="0" distR="0" wp14:anchorId="1D5DADA1" wp14:editId="6D57E1C1">
+            <wp:extent cx="5943600" cy="2769870"/>
+            <wp:effectExtent l="0" t="0" r="0" b="0"/>
+            <wp:docPr id="743448257" name="Picture 1"/>
+            <wp:cNvGraphicFramePr>
+              <a:graphicFrameLocks xmlns:a="http://schemas.openxmlformats.org/drawingml/2006/main" noChangeAspect="1"/>
+            </wp:cNvGraphicFramePr>
+            <a:graphic xmlns:a="http://schemas.openxmlformats.org/drawingml/2006/main">
+              <a:graphicData uri="http://schemas.openxmlformats.org/drawingml/2006/picture">
+                <pic:pic xmlns:pic="http://schemas.openxmlformats.org/drawingml/2006/picture">
+                  <pic:nvPicPr>
+                    <pic:cNvPr id="743448257" name=""/>
+                    <pic:cNvPicPr/>
+                  </pic:nvPicPr>
+                  <pic:blipFill>
+                    <a:blip r:embed="rId7"/>
+                    <a:stretch>
+                      <a:fillRect/>
+                    </a:stretch>
+                  </pic:blipFill>
+                  <pic:spPr>
+                    <a:xfrm>
+                      <a:off x="0" y="0"/>
+                      <a:ext cx="5943600" cy="2769870"/>
                     </a:xfrm>
                     <a:prstGeom prst="rect">
                       <a:avLst/>

</xml_diff>